<commit_message>
docs(manual): fix cover, table overlaps, and QC-figure label collisions
Address rendered-PDF defects from review:
- Cover: affiliation stacked on its own lines, one blank line below the
  author name (author list + \and -> \\).
- §3 stage walkthrough, §6.1 annotation DBs, §11 outputs: pipe tables with
  proportional column widths + dir-level paths so all columns wrap within
  the margin (no column overflow / cross-column overlap).
- §4 install: drop the "(it lives beside CaptureForge)" aside.
- QC figures: regenerate from existing results/ via regen_figures.py, a
  manual-only harness that re-runs the unmodified bin/plot_*.py under a
  monkeypatch suppressing the baked bottom caption (so rotated x-labels no
  longer collide) and padding titles (so top-of-axes value labels, e.g.
  annotation_landing's "100%", clear the title). Pipeline code untouched;
  Nextflow not re-run.
- build_manual.sh: regenerate QC figures (step 1b) when results/ exists.
</commit_message>
<xml_diff>
--- a/docs/manual/callforge_manual.docx
+++ b/docs/manual/callforge_manual.docx
@@ -25,6 +25,11 @@
       <w:r>
         <w:t xml:space="preserve">Bright Adu</w:t>
       </w:r>
+    </w:p>
+    <w:p>
+      <w:pPr>
+        <w:pStyle w:val="Author"/>
+      </w:pPr>
     </w:p>
     <w:p>
       <w:pPr>
@@ -1182,10 +1187,10 @@
         <w:tblLook w:firstRow="1" w:lastRow="0" w:firstColumn="0" w:lastColumn="0" w:noHBand="0" w:noVBand="0" w:val="0020"/>
       </w:tblPr>
       <w:tblGrid>
-        <w:gridCol w:w="1980"/>
-        <w:gridCol w:w="1980"/>
-        <w:gridCol w:w="1980"/>
-        <w:gridCol w:w="1980"/>
+        <w:gridCol w:w="365"/>
+        <w:gridCol w:w="1340"/>
+        <w:gridCol w:w="2558"/>
+        <w:gridCol w:w="3655"/>
       </w:tblGrid>
       <w:tr>
         <w:trPr>
@@ -1196,6 +1201,7 @@
           <w:p>
             <w:pPr>
               <w:pStyle w:val="Compact"/>
+              <w:jc w:val="left"/>
             </w:pPr>
             <w:r>
               <w:t xml:space="preserve">#</w:t>
@@ -1207,6 +1213,7 @@
           <w:p>
             <w:pPr>
               <w:pStyle w:val="Compact"/>
+              <w:jc w:val="left"/>
             </w:pPr>
             <w:r>
               <w:t xml:space="preserve">Stage</w:t>
@@ -1218,6 +1225,7 @@
           <w:p>
             <w:pPr>
               <w:pStyle w:val="Compact"/>
+              <w:jc w:val="left"/>
             </w:pPr>
             <w:r>
               <w:t xml:space="preserve">Key tool(s)</w:t>
@@ -1229,18 +1237,10 @@
           <w:p>
             <w:pPr>
               <w:pStyle w:val="Compact"/>
-            </w:pPr>
-            <w:r>
-              <w:t xml:space="preserve">Main output(s) under</w:t>
-            </w:r>
-            <w:r>
-              <w:t xml:space="preserve"> </w:t>
-            </w:r>
-            <w:r>
-              <w:rPr>
-                <w:rStyle w:val="VerbatimChar"/>
-              </w:rPr>
-              <w:t xml:space="preserve">results/</w:t>
+              <w:jc w:val="left"/>
+            </w:pPr>
+            <w:r>
+              <w:t xml:space="preserve">Output dir + key file(s)</w:t>
             </w:r>
           </w:p>
         </w:tc>
@@ -1251,6 +1251,7 @@
           <w:p>
             <w:pPr>
               <w:pStyle w:val="Compact"/>
+              <w:jc w:val="left"/>
             </w:pPr>
             <w:r>
               <w:t xml:space="preserve">0</w:t>
@@ -1262,6 +1263,7 @@
           <w:p>
             <w:pPr>
               <w:pStyle w:val="Compact"/>
+              <w:jc w:val="left"/>
             </w:pPr>
             <w:r>
               <w:t xml:space="preserve">Inputs &amp; resource discovery</w:t>
@@ -1273,80 +1275,22 @@
           <w:p>
             <w:pPr>
               <w:pStyle w:val="Compact"/>
-            </w:pPr>
-            <w:r>
-              <w:rPr>
-                <w:rStyle w:val="VerbatimChar"/>
-              </w:rPr>
-              <w:t xml:space="preserve">validate_samplesheet</w:t>
-            </w:r>
-            <w:r>
-              <w:t xml:space="preserve">,</w:t>
-            </w:r>
-            <w:r>
-              <w:t xml:space="preserve"> </w:t>
-            </w:r>
-            <w:r>
-              <w:rPr>
-                <w:rStyle w:val="VerbatimChar"/>
-              </w:rPr>
-              <w:t xml:space="preserve">discover_resources</w:t>
-            </w:r>
-            <w:r>
-              <w:t xml:space="preserve">,</w:t>
-            </w:r>
-            <w:r>
-              <w:t xml:space="preserve"> </w:t>
-            </w:r>
-            <w:r>
-              <w:rPr>
-                <w:rStyle w:val="VerbatimChar"/>
-              </w:rPr>
-              <w:t xml:space="preserve">check_reference_invariant</w:t>
-            </w:r>
-            <w:r>
-              <w:t xml:space="preserve">,</w:t>
-            </w:r>
-            <w:r>
-              <w:t xml:space="preserve"> </w:t>
-            </w:r>
-            <w:r>
-              <w:rPr>
-                <w:rStyle w:val="VerbatimChar"/>
-              </w:rPr>
-              <w:t xml:space="preserve">ingest_captureforge</w:t>
-            </w:r>
-          </w:p>
-        </w:tc>
-        <w:tc>
-          <w:tcPr/>
-          <w:p>
-            <w:pPr>
-              <w:pStyle w:val="Compact"/>
-            </w:pPr>
-            <w:r>
-              <w:rPr>
-                <w:rStyle w:val="VerbatimChar"/>
-              </w:rPr>
-              <w:t xml:space="preserve">stage0_inputs/</w:t>
-            </w:r>
-            <w:r>
-              <w:t xml:space="preserve"> </w:t>
-            </w:r>
-            <w:r>
-              <w:t xml:space="preserve">(manifest, invariant,</w:t>
-            </w:r>
-            <w:r>
-              <w:t xml:space="preserve"> </w:t>
-            </w:r>
-            <w:r>
-              <w:rPr>
-                <w:rStyle w:val="VerbatimChar"/>
-              </w:rPr>
-              <w:t xml:space="preserve">gene_metadata.tsv</w:t>
-            </w:r>
-            <w:r>
-              <w:t xml:space="preserve">)</w:t>
+              <w:jc w:val="left"/>
+            </w:pPr>
+            <w:r>
+              <w:t xml:space="preserve">validate_samplesheet, discover_resources, ingest_captureforge</w:t>
+            </w:r>
+          </w:p>
+        </w:tc>
+        <w:tc>
+          <w:tcPr/>
+          <w:p>
+            <w:pPr>
+              <w:pStyle w:val="Compact"/>
+              <w:jc w:val="left"/>
+            </w:pPr>
+            <w:r>
+              <w:t xml:space="preserve">stage0_inputs/ — manifest, invariant, gene_metadata.tsv</w:t>
             </w:r>
           </w:p>
         </w:tc>
@@ -1357,6 +1301,7 @@
           <w:p>
             <w:pPr>
               <w:pStyle w:val="Compact"/>
+              <w:jc w:val="left"/>
             </w:pPr>
             <w:r>
               <w:t xml:space="preserve">1</w:t>
@@ -1368,6 +1313,7 @@
           <w:p>
             <w:pPr>
               <w:pStyle w:val="Compact"/>
+              <w:jc w:val="left"/>
             </w:pPr>
             <w:r>
               <w:t xml:space="preserve">Raw-read QC</w:t>
@@ -1379,6 +1325,7 @@
           <w:p>
             <w:pPr>
               <w:pStyle w:val="Compact"/>
+              <w:jc w:val="left"/>
             </w:pPr>
             <w:r>
               <w:t xml:space="preserve">FastQC</w:t>
@@ -1390,11 +1337,9 @@
           <w:p>
             <w:pPr>
               <w:pStyle w:val="Compact"/>
-            </w:pPr>
-            <w:r>
-              <w:rPr>
-                <w:rStyle w:val="VerbatimChar"/>
-              </w:rPr>
+              <w:jc w:val="left"/>
+            </w:pPr>
+            <w:r>
               <w:t xml:space="preserve">stage1_rawqc/</w:t>
             </w:r>
           </w:p>
@@ -1406,6 +1351,7 @@
           <w:p>
             <w:pPr>
               <w:pStyle w:val="Compact"/>
+              <w:jc w:val="left"/>
             </w:pPr>
             <w:r>
               <w:t xml:space="preserve">2</w:t>
@@ -1417,6 +1363,7 @@
           <w:p>
             <w:pPr>
               <w:pStyle w:val="Compact"/>
+              <w:jc w:val="left"/>
             </w:pPr>
             <w:r>
               <w:t xml:space="preserve">Trimming</w:t>
@@ -1428,6 +1375,7 @@
           <w:p>
             <w:pPr>
               <w:pStyle w:val="Compact"/>
+              <w:jc w:val="left"/>
             </w:pPr>
             <w:r>
               <w:t xml:space="preserve">fastp</w:t>
@@ -1439,11 +1387,9 @@
           <w:p>
             <w:pPr>
               <w:pStyle w:val="Compact"/>
-            </w:pPr>
-            <w:r>
-              <w:rPr>
-                <w:rStyle w:val="VerbatimChar"/>
-              </w:rPr>
+              <w:jc w:val="left"/>
+            </w:pPr>
+            <w:r>
               <w:t xml:space="preserve">stage2_trim/</w:t>
             </w:r>
           </w:p>
@@ -1455,6 +1401,7 @@
           <w:p>
             <w:pPr>
               <w:pStyle w:val="Compact"/>
+              <w:jc w:val="left"/>
             </w:pPr>
             <w:r>
               <w:t xml:space="preserve">3</w:t>
@@ -1466,6 +1413,7 @@
           <w:p>
             <w:pPr>
               <w:pStyle w:val="Compact"/>
+              <w:jc w:val="left"/>
             </w:pPr>
             <w:r>
               <w:t xml:space="preserve">Alignment</w:t>
@@ -1477,22 +1425,21 @@
           <w:p>
             <w:pPr>
               <w:pStyle w:val="Compact"/>
-            </w:pPr>
-            <w:r>
-              <w:t xml:space="preserve">bwa-mem2 → samtools sort</w:t>
-            </w:r>
-          </w:p>
-        </w:tc>
-        <w:tc>
-          <w:tcPr/>
-          <w:p>
-            <w:pPr>
-              <w:pStyle w:val="Compact"/>
-            </w:pPr>
-            <w:r>
-              <w:rPr>
-                <w:rStyle w:val="VerbatimChar"/>
-              </w:rPr>
+              <w:jc w:val="left"/>
+            </w:pPr>
+            <w:r>
+              <w:t xml:space="preserve">bwa-mem2, samtools sort</w:t>
+            </w:r>
+          </w:p>
+        </w:tc>
+        <w:tc>
+          <w:tcPr/>
+          <w:p>
+            <w:pPr>
+              <w:pStyle w:val="Compact"/>
+              <w:jc w:val="left"/>
+            </w:pPr>
+            <w:r>
               <w:t xml:space="preserve">stage3_align/</w:t>
             </w:r>
           </w:p>
@@ -1504,6 +1451,7 @@
           <w:p>
             <w:pPr>
               <w:pStyle w:val="Compact"/>
+              <w:jc w:val="left"/>
             </w:pPr>
             <w:r>
               <w:t xml:space="preserve">4</w:t>
@@ -1515,6 +1463,7 @@
           <w:p>
             <w:pPr>
               <w:pStyle w:val="Compact"/>
+              <w:jc w:val="left"/>
             </w:pPr>
             <w:r>
               <w:t xml:space="preserve">Post-alignment</w:t>
@@ -1526,6 +1475,7 @@
           <w:p>
             <w:pPr>
               <w:pStyle w:val="Compact"/>
+              <w:jc w:val="left"/>
             </w:pPr>
             <w:r>
               <w:t xml:space="preserve">Picard MarkDuplicates, GATK BQSR, CollectHsMetrics, mosdepth</w:t>
@@ -1537,12 +1487,10 @@
           <w:p>
             <w:pPr>
               <w:pStyle w:val="Compact"/>
-            </w:pPr>
-            <w:r>
-              <w:rPr>
-                <w:rStyle w:val="VerbatimChar"/>
-              </w:rPr>
-              <w:t xml:space="preserve">stage4_postalign/</w:t>
+              <w:jc w:val="left"/>
+            </w:pPr>
+            <w:r>
+              <w:t xml:space="preserve">stage4_postalign/ — HsMetrics, mosdepth per-gene depth</w:t>
             </w:r>
           </w:p>
         </w:tc>
@@ -1553,6 +1501,7 @@
           <w:p>
             <w:pPr>
               <w:pStyle w:val="Compact"/>
+              <w:jc w:val="left"/>
             </w:pPr>
             <w:r>
               <w:t xml:space="preserve">5</w:t>
@@ -1564,6 +1513,7 @@
           <w:p>
             <w:pPr>
               <w:pStyle w:val="Compact"/>
+              <w:jc w:val="left"/>
             </w:pPr>
             <w:r>
               <w:t xml:space="preserve">Per-sample QC gate</w:t>
@@ -1575,11 +1525,9 @@
           <w:p>
             <w:pPr>
               <w:pStyle w:val="Compact"/>
-            </w:pPr>
-            <w:r>
-              <w:rPr>
-                <w:rStyle w:val="VerbatimChar"/>
-              </w:rPr>
+              <w:jc w:val="left"/>
+            </w:pPr>
+            <w:r>
               <w:t xml:space="preserve">qc_gate.py</w:t>
             </w:r>
           </w:p>
@@ -1589,39 +1537,10 @@
           <w:p>
             <w:pPr>
               <w:pStyle w:val="Compact"/>
-            </w:pPr>
-            <w:r>
-              <w:rPr>
-                <w:rStyle w:val="VerbatimChar"/>
-              </w:rPr>
-              <w:t xml:space="preserve">stage5_qc_gate/</w:t>
-            </w:r>
-            <w:r>
-              <w:t xml:space="preserve"> </w:t>
-            </w:r>
-            <w:r>
-              <w:t xml:space="preserve">(</w:t>
-            </w:r>
-            <w:r>
-              <w:rPr>
-                <w:rStyle w:val="VerbatimChar"/>
-              </w:rPr>
-              <w:t xml:space="preserve">qc_pass.txt</w:t>
-            </w:r>
-            <w:r>
-              <w:t xml:space="preserve">,</w:t>
-            </w:r>
-            <w:r>
-              <w:t xml:space="preserve"> </w:t>
-            </w:r>
-            <w:r>
-              <w:rPr>
-                <w:rStyle w:val="VerbatimChar"/>
-              </w:rPr>
-              <w:t xml:space="preserve">qc_quarantine.txt</w:t>
-            </w:r>
-            <w:r>
-              <w:t xml:space="preserve">)</w:t>
+              <w:jc w:val="left"/>
+            </w:pPr>
+            <w:r>
+              <w:t xml:space="preserve">stage5_qc_gate/ — qc_pass.txt, qc_quarantine.txt</w:t>
             </w:r>
           </w:p>
         </w:tc>
@@ -1632,6 +1551,7 @@
           <w:p>
             <w:pPr>
               <w:pStyle w:val="Compact"/>
+              <w:jc w:val="left"/>
             </w:pPr>
             <w:r>
               <w:t xml:space="preserve">6</w:t>
@@ -1643,6 +1563,7 @@
           <w:p>
             <w:pPr>
               <w:pStyle w:val="Compact"/>
+              <w:jc w:val="left"/>
             </w:pPr>
             <w:r>
               <w:t xml:space="preserve">SNV/indel joint calling</w:t>
@@ -1654,23 +1575,22 @@
           <w:p>
             <w:pPr>
               <w:pStyle w:val="Compact"/>
-            </w:pPr>
-            <w:r>
-              <w:t xml:space="preserve">GATK HaplotypeCaller → GenomicsDBImport → GenotypeGVCFs</w:t>
-            </w:r>
-          </w:p>
-        </w:tc>
-        <w:tc>
-          <w:tcPr/>
-          <w:p>
-            <w:pPr>
-              <w:pStyle w:val="Compact"/>
-            </w:pPr>
-            <w:r>
-              <w:rPr>
-                <w:rStyle w:val="VerbatimChar"/>
-              </w:rPr>
-              <w:t xml:space="preserve">stage6_calling/joint.vcf.gz</w:t>
+              <w:jc w:val="left"/>
+            </w:pPr>
+            <w:r>
+              <w:t xml:space="preserve">GATK HaplotypeCaller, GenomicsDBImport, GenotypeGVCFs</w:t>
+            </w:r>
+          </w:p>
+        </w:tc>
+        <w:tc>
+          <w:tcPr/>
+          <w:p>
+            <w:pPr>
+              <w:pStyle w:val="Compact"/>
+              <w:jc w:val="left"/>
+            </w:pPr>
+            <w:r>
+              <w:t xml:space="preserve">stage6_calling/ — joint.vcf.gz</w:t>
             </w:r>
           </w:p>
         </w:tc>
@@ -1681,6 +1601,7 @@
           <w:p>
             <w:pPr>
               <w:pStyle w:val="Compact"/>
+              <w:jc w:val="left"/>
             </w:pPr>
             <w:r>
               <w:t xml:space="preserve">7</w:t>
@@ -1692,6 +1613,7 @@
           <w:p>
             <w:pPr>
               <w:pStyle w:val="Compact"/>
+              <w:jc w:val="left"/>
             </w:pPr>
             <w:r>
               <w:t xml:space="preserve">Hard-filtering</w:t>
@@ -1703,23 +1625,22 @@
           <w:p>
             <w:pPr>
               <w:pStyle w:val="Compact"/>
-            </w:pPr>
-            <w:r>
-              <w:t xml:space="preserve">GATK VariantFiltration → MergeVcfs</w:t>
-            </w:r>
-          </w:p>
-        </w:tc>
-        <w:tc>
-          <w:tcPr/>
-          <w:p>
-            <w:pPr>
-              <w:pStyle w:val="Compact"/>
-            </w:pPr>
-            <w:r>
-              <w:rPr>
-                <w:rStyle w:val="VerbatimChar"/>
-              </w:rPr>
-              <w:t xml:space="preserve">stage7_filter/joint.filtered.vcf.gz</w:t>
+              <w:jc w:val="left"/>
+            </w:pPr>
+            <w:r>
+              <w:t xml:space="preserve">GATK VariantFiltration, MergeVcfs</w:t>
+            </w:r>
+          </w:p>
+        </w:tc>
+        <w:tc>
+          <w:tcPr/>
+          <w:p>
+            <w:pPr>
+              <w:pStyle w:val="Compact"/>
+              <w:jc w:val="left"/>
+            </w:pPr>
+            <w:r>
+              <w:t xml:space="preserve">stage7_filter/ — joint.filtered.vcf.gz</w:t>
             </w:r>
           </w:p>
         </w:tc>
@@ -1730,6 +1651,7 @@
           <w:p>
             <w:pPr>
               <w:pStyle w:val="Compact"/>
+              <w:jc w:val="left"/>
             </w:pPr>
             <w:r>
               <w:t xml:space="preserve">8</w:t>
@@ -1741,6 +1663,7 @@
           <w:p>
             <w:pPr>
               <w:pStyle w:val="Compact"/>
+              <w:jc w:val="left"/>
             </w:pPr>
             <w:r>
               <w:t xml:space="preserve">CNV</w:t>
@@ -1752,6 +1675,7 @@
           <w:p>
             <w:pPr>
               <w:pStyle w:val="Compact"/>
+              <w:jc w:val="left"/>
             </w:pPr>
             <w:r>
               <w:t xml:space="preserve">CNVkit</w:t>
@@ -1763,27 +1687,10 @@
           <w:p>
             <w:pPr>
               <w:pStyle w:val="Compact"/>
-            </w:pPr>
-            <w:r>
-              <w:rPr>
-                <w:rStyle w:val="VerbatimChar"/>
-              </w:rPr>
-              <w:t xml:space="preserve">stage8_cnv/</w:t>
-            </w:r>
-            <w:r>
-              <w:t xml:space="preserve"> </w:t>
-            </w:r>
-            <w:r>
-              <w:t xml:space="preserve">(</w:t>
-            </w:r>
-            <w:r>
-              <w:rPr>
-                <w:rStyle w:val="VerbatimChar"/>
-              </w:rPr>
-              <w:t xml:space="preserve">cnv_calls.tsv</w:t>
-            </w:r>
-            <w:r>
-              <w:t xml:space="preserve">, callability)</w:t>
+              <w:jc w:val="left"/>
+            </w:pPr>
+            <w:r>
+              <w:t xml:space="preserve">stage8_cnv/ — cnv_calls.tsv (with callability)</w:t>
             </w:r>
           </w:p>
         </w:tc>
@@ -1794,6 +1701,7 @@
           <w:p>
             <w:pPr>
               <w:pStyle w:val="Compact"/>
+              <w:jc w:val="left"/>
             </w:pPr>
             <w:r>
               <w:t xml:space="preserve">9</w:t>
@@ -1805,6 +1713,7 @@
           <w:p>
             <w:pPr>
               <w:pStyle w:val="Compact"/>
+              <w:jc w:val="left"/>
             </w:pPr>
             <w:r>
               <w:t xml:space="preserve">STR</w:t>
@@ -1816,6 +1725,7 @@
           <w:p>
             <w:pPr>
               <w:pStyle w:val="Compact"/>
+              <w:jc w:val="left"/>
             </w:pPr>
             <w:r>
               <w:t xml:space="preserve">ExpansionHunter</w:t>
@@ -1827,12 +1737,10 @@
           <w:p>
             <w:pPr>
               <w:pStyle w:val="Compact"/>
-            </w:pPr>
-            <w:r>
-              <w:rPr>
-                <w:rStyle w:val="VerbatimChar"/>
-              </w:rPr>
-              <w:t xml:space="preserve">stage9_str/</w:t>
+              <w:jc w:val="left"/>
+            </w:pPr>
+            <w:r>
+              <w:t xml:space="preserve">stage9_str/ — str_calls.tsv</w:t>
             </w:r>
           </w:p>
         </w:tc>
@@ -1843,6 +1751,7 @@
           <w:p>
             <w:pPr>
               <w:pStyle w:val="Compact"/>
+              <w:jc w:val="left"/>
             </w:pPr>
             <w:r>
               <w:t xml:space="preserve">10</w:t>
@@ -1854,6 +1763,7 @@
           <w:p>
             <w:pPr>
               <w:pStyle w:val="Compact"/>
+              <w:jc w:val="left"/>
             </w:pPr>
             <w:r>
               <w:t xml:space="preserve">Paralog-aware</w:t>
@@ -1865,11 +1775,9 @@
           <w:p>
             <w:pPr>
               <w:pStyle w:val="Compact"/>
-            </w:pPr>
-            <w:r>
-              <w:rPr>
-                <w:rStyle w:val="VerbatimChar"/>
-              </w:rPr>
+              <w:jc w:val="left"/>
+            </w:pPr>
+            <w:r>
               <w:t xml:space="preserve">paralog_flag.py</w:t>
             </w:r>
           </w:p>
@@ -1879,12 +1787,10 @@
           <w:p>
             <w:pPr>
               <w:pStyle w:val="Compact"/>
-            </w:pPr>
-            <w:r>
-              <w:rPr>
-                <w:rStyle w:val="VerbatimChar"/>
-              </w:rPr>
-              <w:t xml:space="preserve">stage10_paralog/paralog.annotated.vcf.gz</w:t>
+              <w:jc w:val="left"/>
+            </w:pPr>
+            <w:r>
+              <w:t xml:space="preserve">stage10_paralog/ — paralog.annotated.vcf.gz</w:t>
             </w:r>
           </w:p>
         </w:tc>
@@ -1895,6 +1801,7 @@
           <w:p>
             <w:pPr>
               <w:pStyle w:val="Compact"/>
+              <w:jc w:val="left"/>
             </w:pPr>
             <w:r>
               <w:t xml:space="preserve">11</w:t>
@@ -1906,6 +1813,7 @@
           <w:p>
             <w:pPr>
               <w:pStyle w:val="Compact"/>
+              <w:jc w:val="left"/>
             </w:pPr>
             <w:r>
               <w:t xml:space="preserve">Annotation</w:t>
@@ -1917,35 +1825,22 @@
           <w:p>
             <w:pPr>
               <w:pStyle w:val="Compact"/>
-            </w:pPr>
-            <w:r>
-              <w:t xml:space="preserve">VEP + vcfanno + PhyloP</w:t>
-            </w:r>
-          </w:p>
-        </w:tc>
-        <w:tc>
-          <w:tcPr/>
-          <w:p>
-            <w:pPr>
-              <w:pStyle w:val="Compact"/>
-            </w:pPr>
-            <w:r>
-              <w:rPr>
-                <w:rStyle w:val="VerbatimChar"/>
-              </w:rPr>
-              <w:t xml:space="preserve">stage11_annotation/annotated.vcf.gz</w:t>
-            </w:r>
-            <w:r>
-              <w:t xml:space="preserve">,</w:t>
-            </w:r>
-            <w:r>
-              <w:t xml:space="preserve"> </w:t>
-            </w:r>
-            <w:r>
-              <w:rPr>
-                <w:rStyle w:val="VerbatimChar"/>
-              </w:rPr>
-              <w:t xml:space="preserve">variants.flat.tsv</w:t>
+              <w:jc w:val="left"/>
+            </w:pPr>
+            <w:r>
+              <w:t xml:space="preserve">VEP, vcfanno, PhyloP</w:t>
+            </w:r>
+          </w:p>
+        </w:tc>
+        <w:tc>
+          <w:tcPr/>
+          <w:p>
+            <w:pPr>
+              <w:pStyle w:val="Compact"/>
+              <w:jc w:val="left"/>
+            </w:pPr>
+            <w:r>
+              <w:t xml:space="preserve">stage11_annotation/ — annotated.vcf.gz, variants.flat.tsv</w:t>
             </w:r>
           </w:p>
         </w:tc>
@@ -1956,6 +1851,7 @@
           <w:p>
             <w:pPr>
               <w:pStyle w:val="Compact"/>
+              <w:jc w:val="left"/>
             </w:pPr>
             <w:r>
               <w:t xml:space="preserve">12</w:t>
@@ -1967,6 +1863,7 @@
           <w:p>
             <w:pPr>
               <w:pStyle w:val="Compact"/>
+              <w:jc w:val="left"/>
             </w:pPr>
             <w:r>
               <w:t xml:space="preserve">Cohort QC</w:t>
@@ -1978,6 +1875,7 @@
           <w:p>
             <w:pPr>
               <w:pStyle w:val="Compact"/>
+              <w:jc w:val="left"/>
             </w:pPr>
             <w:r>
               <w:t xml:space="preserve">somalier</w:t>
@@ -1989,11 +1887,9 @@
           <w:p>
             <w:pPr>
               <w:pStyle w:val="Compact"/>
-            </w:pPr>
-            <w:r>
-              <w:rPr>
-                <w:rStyle w:val="VerbatimChar"/>
-              </w:rPr>
+              <w:jc w:val="left"/>
+            </w:pPr>
+            <w:r>
               <w:t xml:space="preserve">stage12_cohortqc/</w:t>
             </w:r>
           </w:p>
@@ -2005,6 +1901,7 @@
           <w:p>
             <w:pPr>
               <w:pStyle w:val="Compact"/>
+              <w:jc w:val="left"/>
             </w:pPr>
             <w:r>
               <w:t xml:space="preserve">13</w:t>
@@ -2016,6 +1913,7 @@
           <w:p>
             <w:pPr>
               <w:pStyle w:val="Compact"/>
+              <w:jc w:val="left"/>
             </w:pPr>
             <w:r>
               <w:t xml:space="preserve">GIAB validation</w:t>
@@ -2027,6 +1925,7 @@
           <w:p>
             <w:pPr>
               <w:pStyle w:val="Compact"/>
+              <w:jc w:val="left"/>
             </w:pPr>
             <w:r>
               <w:t xml:space="preserve">hap.py</w:t>
@@ -2038,11 +1937,9 @@
           <w:p>
             <w:pPr>
               <w:pStyle w:val="Compact"/>
-            </w:pPr>
-            <w:r>
-              <w:rPr>
-                <w:rStyle w:val="VerbatimChar"/>
-              </w:rPr>
+              <w:jc w:val="left"/>
+            </w:pPr>
+            <w:r>
               <w:t xml:space="preserve">stage13_giab/</w:t>
             </w:r>
           </w:p>
@@ -2054,6 +1951,7 @@
           <w:p>
             <w:pPr>
               <w:pStyle w:val="Compact"/>
+              <w:jc w:val="left"/>
             </w:pPr>
             <w:r>
               <w:t xml:space="preserve">14</w:t>
@@ -2065,6 +1963,7 @@
           <w:p>
             <w:pPr>
               <w:pStyle w:val="Compact"/>
+              <w:jc w:val="left"/>
             </w:pPr>
             <w:r>
               <w:t xml:space="preserve">Burden / association</w:t>
@@ -2076,6 +1975,7 @@
           <w:p>
             <w:pPr>
               <w:pStyle w:val="Compact"/>
+              <w:jc w:val="left"/>
             </w:pPr>
             <w:r>
               <w:t xml:space="preserve">collapse / regenie / SKAT-O</w:t>
@@ -2087,12 +1987,10 @@
           <w:p>
             <w:pPr>
               <w:pStyle w:val="Compact"/>
-            </w:pPr>
-            <w:r>
-              <w:rPr>
-                <w:rStyle w:val="VerbatimChar"/>
-              </w:rPr>
-              <w:t xml:space="preserve">stage14_burden/burden_results.tsv</w:t>
+              <w:jc w:val="left"/>
+            </w:pPr>
+            <w:r>
+              <w:t xml:space="preserve">stage14_burden/ — burden_results.tsv</w:t>
             </w:r>
           </w:p>
         </w:tc>
@@ -2103,6 +2001,7 @@
           <w:p>
             <w:pPr>
               <w:pStyle w:val="Compact"/>
+              <w:jc w:val="left"/>
             </w:pPr>
             <w:r>
               <w:t xml:space="preserve">15</w:t>
@@ -2114,6 +2013,7 @@
           <w:p>
             <w:pPr>
               <w:pStyle w:val="Compact"/>
+              <w:jc w:val="left"/>
             </w:pPr>
             <w:r>
               <w:t xml:space="preserve">Reporting</w:t>
@@ -2125,22 +2025,21 @@
           <w:p>
             <w:pPr>
               <w:pStyle w:val="Compact"/>
-            </w:pPr>
-            <w:r>
-              <w:t xml:space="preserve">MultiQC + dashboard + provenance</w:t>
-            </w:r>
-          </w:p>
-        </w:tc>
-        <w:tc>
-          <w:tcPr/>
-          <w:p>
-            <w:pPr>
-              <w:pStyle w:val="Compact"/>
-            </w:pPr>
-            <w:r>
-              <w:rPr>
-                <w:rStyle w:val="VerbatimChar"/>
-              </w:rPr>
+              <w:jc w:val="left"/>
+            </w:pPr>
+            <w:r>
+              <w:t xml:space="preserve">MultiQC, dashboard, provenance</w:t>
+            </w:r>
+          </w:p>
+        </w:tc>
+        <w:tc>
+          <w:tcPr/>
+          <w:p>
+            <w:pPr>
+              <w:pStyle w:val="Compact"/>
+              <w:jc w:val="left"/>
+            </w:pPr>
+            <w:r>
               <w:t xml:space="preserve">stage15_report/</w:t>
             </w:r>
           </w:p>
@@ -2643,7 +2542,7 @@
         <w:rPr>
           <w:rStyle w:val="CommentTok"/>
         </w:rPr>
-        <w:t xml:space="preserve"># 2. clone CallForge (it lives beside CaptureForge)</w:t>
+        <w:t xml:space="preserve"># 2. obtain CallForge and enter the repository</w:t>
       </w:r>
       <w:r>
         <w:br/>
@@ -2658,7 +2557,7 @@
         <w:rPr>
           <w:rStyle w:val="NormalTok"/>
         </w:rPr>
-        <w:t xml:space="preserve"> ~/Documents/Claude/Projects/callforge</w:t>
+        <w:t xml:space="preserve"> /path/to/callforge</w:t>
       </w:r>
       <w:r>
         <w:br/>
@@ -4384,11 +4283,10 @@
         <w:tblLook w:firstRow="1" w:lastRow="0" w:firstColumn="0" w:lastColumn="0" w:noHBand="0" w:noVBand="0" w:val="0020"/>
       </w:tblPr>
       <w:tblGrid>
-        <w:gridCol w:w="1584"/>
-        <w:gridCol w:w="1584"/>
-        <w:gridCol w:w="1584"/>
-        <w:gridCol w:w="1584"/>
-        <w:gridCol w:w="1584"/>
+        <w:gridCol w:w="1102"/>
+        <w:gridCol w:w="2907"/>
+        <w:gridCol w:w="2506"/>
+        <w:gridCol w:w="1403"/>
       </w:tblGrid>
       <w:tr>
         <w:trPr>
@@ -4399,6 +4297,7 @@
           <w:p>
             <w:pPr>
               <w:pStyle w:val="Compact"/>
+              <w:jc w:val="left"/>
             </w:pPr>
             <w:r>
               <w:t xml:space="preserve">Database</w:t>
@@ -4410,6 +4309,7 @@
           <w:p>
             <w:pPr>
               <w:pStyle w:val="Compact"/>
+              <w:jc w:val="left"/>
             </w:pPr>
             <w:r>
               <w:t xml:space="preserve">Provides</w:t>
@@ -4421,31 +4321,22 @@
           <w:p>
             <w:pPr>
               <w:pStyle w:val="Compact"/>
-            </w:pPr>
-            <w:r>
-              <w:t xml:space="preserve">Stage(s)</w:t>
-            </w:r>
-          </w:p>
-        </w:tc>
-        <w:tc>
-          <w:tcPr/>
-          <w:p>
-            <w:pPr>
-              <w:pStyle w:val="Compact"/>
-            </w:pPr>
-            <w:r>
-              <w:t xml:space="preserve">Param</w:t>
-            </w:r>
-          </w:p>
-        </w:tc>
-        <w:tc>
-          <w:tcPr/>
-          <w:p>
-            <w:pPr>
-              <w:pStyle w:val="Compact"/>
-            </w:pPr>
-            <w:r>
-              <w:t xml:space="preserve">Scope requirement</w:t>
+              <w:jc w:val="left"/>
+            </w:pPr>
+            <w:r>
+              <w:t xml:space="preserve">Stage(s) / param</w:t>
+            </w:r>
+          </w:p>
+        </w:tc>
+        <w:tc>
+          <w:tcPr/>
+          <w:p>
+            <w:pPr>
+              <w:pStyle w:val="Compact"/>
+              <w:jc w:val="left"/>
+            </w:pPr>
+            <w:r>
+              <w:t xml:space="preserve">Scope</w:t>
             </w:r>
           </w:p>
         </w:tc>
@@ -4456,84 +4347,43 @@
           <w:p>
             <w:pPr>
               <w:pStyle w:val="Compact"/>
-            </w:pPr>
-            <w:r>
-              <w:rPr>
-                <w:b/>
-                <w:bCs/>
-              </w:rPr>
-              <w:t xml:space="preserve">gnomAD</w:t>
-            </w:r>
-            <w:r>
-              <w:t xml:space="preserve"> </w:t>
-            </w:r>
-            <w:r>
-              <w:t xml:space="preserve">(AFR)</w:t>
-            </w:r>
-          </w:p>
-        </w:tc>
-        <w:tc>
-          <w:tcPr/>
-          <w:p>
-            <w:pPr>
-              <w:pStyle w:val="Compact"/>
-            </w:pPr>
-            <w:r>
-              <w:t xml:space="preserve">population allele frequencies, incl. African-ancestry</w:t>
-            </w:r>
-            <w:r>
-              <w:t xml:space="preserve"> </w:t>
-            </w:r>
-            <w:r>
-              <w:rPr>
-                <w:rStyle w:val="VerbatimChar"/>
-              </w:rPr>
-              <w:t xml:space="preserve">AF_afr</w:t>
-            </w:r>
-          </w:p>
-        </w:tc>
-        <w:tc>
-          <w:tcPr/>
-          <w:p>
-            <w:pPr>
-              <w:pStyle w:val="Compact"/>
-            </w:pPr>
-            <w:r>
-              <w:t xml:space="preserve">11 (vcfanno), 14 (rare filter)</w:t>
-            </w:r>
-          </w:p>
-        </w:tc>
-        <w:tc>
-          <w:tcPr/>
-          <w:p>
-            <w:pPr>
-              <w:pStyle w:val="Compact"/>
-            </w:pPr>
-            <w:r>
-              <w:rPr>
-                <w:rStyle w:val="VerbatimChar"/>
-              </w:rPr>
-              <w:t xml:space="preserve">--gnomad_vcf</w:t>
-            </w:r>
-            <w:r>
-              <w:t xml:space="preserve">,</w:t>
-            </w:r>
-            <w:r>
-              <w:t xml:space="preserve"> </w:t>
-            </w:r>
-            <w:r>
-              <w:rPr>
-                <w:rStyle w:val="VerbatimChar"/>
-              </w:rPr>
-              <w:t xml:space="preserve">--gnomad_af_field AF_afr</w:t>
-            </w:r>
-          </w:p>
-        </w:tc>
-        <w:tc>
-          <w:tcPr/>
-          <w:p>
-            <w:pPr>
-              <w:pStyle w:val="Compact"/>
+              <w:jc w:val="left"/>
+            </w:pPr>
+            <w:r>
+              <w:t xml:space="preserve">gnomAD (AFR)</w:t>
+            </w:r>
+          </w:p>
+        </w:tc>
+        <w:tc>
+          <w:tcPr/>
+          <w:p>
+            <w:pPr>
+              <w:pStyle w:val="Compact"/>
+              <w:jc w:val="left"/>
+            </w:pPr>
+            <w:r>
+              <w:t xml:space="preserve">population allele frequencies, incl. African-ancestry AF_afr</w:t>
+            </w:r>
+          </w:p>
+        </w:tc>
+        <w:tc>
+          <w:tcPr/>
+          <w:p>
+            <w:pPr>
+              <w:pStyle w:val="Compact"/>
+              <w:jc w:val="left"/>
+            </w:pPr>
+            <w:r>
+              <w:t xml:space="preserve">11 (vcfanno), 14 (rare filter); –gnomad_vcf, –gnomad_af_field</w:t>
+            </w:r>
+          </w:p>
+        </w:tc>
+        <w:tc>
+          <w:tcPr/>
+          <w:p>
+            <w:pPr>
+              <w:pStyle w:val="Compact"/>
+              <w:jc w:val="left"/>
             </w:pPr>
             <w:r>
               <w:t xml:space="preserve">genome-wide; scope-gated</w:t>
@@ -4547,12 +4397,9 @@
           <w:p>
             <w:pPr>
               <w:pStyle w:val="Compact"/>
-            </w:pPr>
-            <w:r>
-              <w:rPr>
-                <w:b/>
-                <w:bCs/>
-              </w:rPr>
+              <w:jc w:val="left"/>
+            </w:pPr>
+            <w:r>
               <w:t xml:space="preserve">ClinVar</w:t>
             </w:r>
           </w:p>
@@ -4562,75 +4409,31 @@
           <w:p>
             <w:pPr>
               <w:pStyle w:val="Compact"/>
-            </w:pPr>
-            <w:r>
-              <w:t xml:space="preserve">clinical significance (</w:t>
-            </w:r>
-            <w:r>
-              <w:rPr>
-                <w:rStyle w:val="VerbatimChar"/>
-              </w:rPr>
-              <w:t xml:space="preserve">CLNSIG</w:t>
-            </w:r>
-            <w:r>
-              <w:t xml:space="preserve">,</w:t>
-            </w:r>
-            <w:r>
-              <w:t xml:space="preserve"> </w:t>
-            </w:r>
-            <w:r>
-              <w:rPr>
-                <w:rStyle w:val="VerbatimChar"/>
-              </w:rPr>
-              <w:t xml:space="preserve">CLNDN</w:t>
-            </w:r>
-            <w:r>
-              <w:t xml:space="preserve">,</w:t>
-            </w:r>
-            <w:r>
-              <w:t xml:space="preserve"> </w:t>
-            </w:r>
-            <w:r>
-              <w:rPr>
-                <w:rStyle w:val="VerbatimChar"/>
-              </w:rPr>
-              <w:t xml:space="preserve">CLNREVSTAT</w:t>
-            </w:r>
-            <w:r>
-              <w:t xml:space="preserve">, …)</w:t>
-            </w:r>
-          </w:p>
-        </w:tc>
-        <w:tc>
-          <w:tcPr/>
-          <w:p>
-            <w:pPr>
-              <w:pStyle w:val="Compact"/>
-            </w:pPr>
-            <w:r>
-              <w:t xml:space="preserve">11</w:t>
-            </w:r>
-          </w:p>
-        </w:tc>
-        <w:tc>
-          <w:tcPr/>
-          <w:p>
-            <w:pPr>
-              <w:pStyle w:val="Compact"/>
-            </w:pPr>
-            <w:r>
-              <w:rPr>
-                <w:rStyle w:val="VerbatimChar"/>
-              </w:rPr>
-              <w:t xml:space="preserve">--clinvar_vcf</w:t>
-            </w:r>
-          </w:p>
-        </w:tc>
-        <w:tc>
-          <w:tcPr/>
-          <w:p>
-            <w:pPr>
-              <w:pStyle w:val="Compact"/>
+              <w:jc w:val="left"/>
+            </w:pPr>
+            <w:r>
+              <w:t xml:space="preserve">clinical significance (CLNSIG, CLNDN, CLNREVSTAT, …)</w:t>
+            </w:r>
+          </w:p>
+        </w:tc>
+        <w:tc>
+          <w:tcPr/>
+          <w:p>
+            <w:pPr>
+              <w:pStyle w:val="Compact"/>
+              <w:jc w:val="left"/>
+            </w:pPr>
+            <w:r>
+              <w:t xml:space="preserve">11; –clinvar_vcf</w:t>
+            </w:r>
+          </w:p>
+        </w:tc>
+        <w:tc>
+          <w:tcPr/>
+          <w:p>
+            <w:pPr>
+              <w:pStyle w:val="Compact"/>
+              <w:jc w:val="left"/>
             </w:pPr>
             <w:r>
               <w:t xml:space="preserve">genome-wide; scope-gated</w:t>
@@ -4644,12 +4447,9 @@
           <w:p>
             <w:pPr>
               <w:pStyle w:val="Compact"/>
-            </w:pPr>
-            <w:r>
-              <w:rPr>
-                <w:b/>
-                <w:bCs/>
-              </w:rPr>
+              <w:jc w:val="left"/>
+            </w:pPr>
+            <w:r>
               <w:t xml:space="preserve">dbSNP</w:t>
             </w:r>
           </w:p>
@@ -4659,6 +4459,7 @@
           <w:p>
             <w:pPr>
               <w:pStyle w:val="Compact"/>
+              <w:jc w:val="left"/>
             </w:pPr>
             <w:r>
               <w:t xml:space="preserve">rsIDs (ID column)</w:t>
@@ -4670,43 +4471,19 @@
           <w:p>
             <w:pPr>
               <w:pStyle w:val="Compact"/>
-            </w:pPr>
-            <w:r>
-              <w:t xml:space="preserve">11 (rsID), 4 (BQSR known-site)</w:t>
-            </w:r>
-          </w:p>
-        </w:tc>
-        <w:tc>
-          <w:tcPr/>
-          <w:p>
-            <w:pPr>
-              <w:pStyle w:val="Compact"/>
-            </w:pPr>
-            <w:r>
-              <w:rPr>
-                <w:rStyle w:val="VerbatimChar"/>
-              </w:rPr>
-              <w:t xml:space="preserve">--dbsnp_vcf</w:t>
-            </w:r>
-            <w:r>
-              <w:t xml:space="preserve">,</w:t>
-            </w:r>
-            <w:r>
-              <w:t xml:space="preserve"> </w:t>
-            </w:r>
-            <w:r>
-              <w:rPr>
-                <w:rStyle w:val="VerbatimChar"/>
-              </w:rPr>
-              <w:t xml:space="preserve">--known_sites</w:t>
-            </w:r>
-          </w:p>
-        </w:tc>
-        <w:tc>
-          <w:tcPr/>
-          <w:p>
-            <w:pPr>
-              <w:pStyle w:val="Compact"/>
+              <w:jc w:val="left"/>
+            </w:pPr>
+            <w:r>
+              <w:t xml:space="preserve">11 (rsID), 4 (BQSR); –dbsnp_vcf, –known_sites</w:t>
+            </w:r>
+          </w:p>
+        </w:tc>
+        <w:tc>
+          <w:tcPr/>
+          <w:p>
+            <w:pPr>
+              <w:pStyle w:val="Compact"/>
+              <w:jc w:val="left"/>
             </w:pPr>
             <w:r>
               <w:t xml:space="preserve">genome-wide; scope-gated</w:t>
@@ -4720,12 +4497,9 @@
           <w:p>
             <w:pPr>
               <w:pStyle w:val="Compact"/>
-            </w:pPr>
-            <w:r>
-              <w:rPr>
-                <w:b/>
-                <w:bCs/>
-              </w:rPr>
+              <w:jc w:val="left"/>
+            </w:pPr>
+            <w:r>
               <w:t xml:space="preserve">VEP cache</w:t>
             </w:r>
           </w:p>
@@ -4735,6 +4509,7 @@
           <w:p>
             <w:pPr>
               <w:pStyle w:val="Compact"/>
+              <w:jc w:val="left"/>
             </w:pPr>
             <w:r>
               <w:t xml:space="preserve">consequence, transcript, SIFT/PolyPhen, canonical/MANE</w:t>
@@ -4746,43 +4521,19 @@
           <w:p>
             <w:pPr>
               <w:pStyle w:val="Compact"/>
-            </w:pPr>
-            <w:r>
-              <w:t xml:space="preserve">11</w:t>
-            </w:r>
-          </w:p>
-        </w:tc>
-        <w:tc>
-          <w:tcPr/>
-          <w:p>
-            <w:pPr>
-              <w:pStyle w:val="Compact"/>
-            </w:pPr>
-            <w:r>
-              <w:rPr>
-                <w:rStyle w:val="VerbatimChar"/>
-              </w:rPr>
-              <w:t xml:space="preserve">--vep_cache</w:t>
-            </w:r>
-            <w:r>
-              <w:t xml:space="preserve">,</w:t>
-            </w:r>
-            <w:r>
-              <w:t xml:space="preserve"> </w:t>
-            </w:r>
-            <w:r>
-              <w:rPr>
-                <w:rStyle w:val="VerbatimChar"/>
-              </w:rPr>
-              <w:t xml:space="preserve">--vep_release</w:t>
-            </w:r>
-          </w:p>
-        </w:tc>
-        <w:tc>
-          <w:tcPr/>
-          <w:p>
-            <w:pPr>
-              <w:pStyle w:val="Compact"/>
+              <w:jc w:val="left"/>
+            </w:pPr>
+            <w:r>
+              <w:t xml:space="preserve">11; –vep_cache, –vep_release</w:t>
+            </w:r>
+          </w:p>
+        </w:tc>
+        <w:tc>
+          <w:tcPr/>
+          <w:p>
+            <w:pPr>
+              <w:pStyle w:val="Compact"/>
+              <w:jc w:val="left"/>
             </w:pPr>
             <w:r>
               <w:t xml:space="preserve">species + assembly match</w:t>
@@ -4796,12 +4547,9 @@
           <w:p>
             <w:pPr>
               <w:pStyle w:val="Compact"/>
-            </w:pPr>
-            <w:r>
-              <w:rPr>
-                <w:b/>
-                <w:bCs/>
-              </w:rPr>
+              <w:jc w:val="left"/>
+            </w:pPr>
+            <w:r>
               <w:t xml:space="preserve">PhyloP</w:t>
             </w:r>
           </w:p>
@@ -4811,6 +4559,7 @@
           <w:p>
             <w:pPr>
               <w:pStyle w:val="Compact"/>
+              <w:jc w:val="left"/>
             </w:pPr>
             <w:r>
               <w:t xml:space="preserve">conservation score (bigWig)</w:t>
@@ -4822,31 +4571,19 @@
           <w:p>
             <w:pPr>
               <w:pStyle w:val="Compact"/>
-            </w:pPr>
-            <w:r>
-              <w:t xml:space="preserve">11</w:t>
-            </w:r>
-          </w:p>
-        </w:tc>
-        <w:tc>
-          <w:tcPr/>
-          <w:p>
-            <w:pPr>
-              <w:pStyle w:val="Compact"/>
-            </w:pPr>
-            <w:r>
-              <w:rPr>
-                <w:rStyle w:val="VerbatimChar"/>
-              </w:rPr>
-              <w:t xml:space="preserve">--phylop_bw</w:t>
-            </w:r>
-          </w:p>
-        </w:tc>
-        <w:tc>
-          <w:tcPr/>
-          <w:p>
-            <w:pPr>
-              <w:pStyle w:val="Compact"/>
+              <w:jc w:val="left"/>
+            </w:pPr>
+            <w:r>
+              <w:t xml:space="preserve">11; –phylop_bw</w:t>
+            </w:r>
+          </w:p>
+        </w:tc>
+        <w:tc>
+          <w:tcPr/>
+          <w:p>
+            <w:pPr>
+              <w:pStyle w:val="Compact"/>
+              <w:jc w:val="left"/>
             </w:pPr>
             <w:r>
               <w:t xml:space="preserve">genome-wide</w:t>
@@ -8941,7 +8678,7 @@
       <w:r>
         <w:drawing>
           <wp:inline>
-            <wp:extent cx="3200400" cy="2688336"/>
+            <wp:extent cx="3200400" cy="2936019"/>
             <wp:effectExtent b="0" l="0" r="0" t="0"/>
             <wp:docPr descr="Percent of reads mapped and properly paired per sample (alignment success)." title="" id="41" name="Picture"/>
             <a:graphic>
@@ -8962,7 +8699,7 @@
                   <pic:spPr bwMode="auto">
                     <a:xfrm>
                       <a:off x="0" y="0"/>
-                      <a:ext cx="3200400" cy="2688336"/>
+                      <a:ext cx="3200400" cy="2936019"/>
                     </a:xfrm>
                     <a:prstGeom prst="rect">
                       <a:avLst/>
@@ -8996,7 +8733,7 @@
       <w:r>
         <w:drawing>
           <wp:inline>
-            <wp:extent cx="2933700" cy="2619540"/>
+            <wp:extent cx="2933700" cy="2743031"/>
             <wp:effectExtent b="0" l="0" r="0" t="0"/>
             <wp:docPr descr="Percent of bases on the capture target per sample (capture specificity)." title="" id="44" name="Picture"/>
             <a:graphic>
@@ -9017,7 +8754,7 @@
                   <pic:spPr bwMode="auto">
                     <a:xfrm>
                       <a:off x="0" y="0"/>
-                      <a:ext cx="2933700" cy="2619540"/>
+                      <a:ext cx="2933700" cy="2743031"/>
                     </a:xfrm>
                     <a:prstGeom prst="rect">
                       <a:avLst/>
@@ -9051,7 +8788,7 @@
       <w:r>
         <w:drawing>
           <wp:inline>
-            <wp:extent cx="2933700" cy="2424792"/>
+            <wp:extent cx="2933700" cy="2718934"/>
             <wp:effectExtent b="0" l="0" r="0" t="0"/>
             <wp:docPr descr="Fold-enrichment of on-target vs genome-average coverage (capture performance)." title="" id="47" name="Picture"/>
             <a:graphic>
@@ -9072,7 +8809,7 @@
                   <pic:spPr bwMode="auto">
                     <a:xfrm>
                       <a:off x="0" y="0"/>
-                      <a:ext cx="2933700" cy="2424792"/>
+                      <a:ext cx="2933700" cy="2718934"/>
                     </a:xfrm>
                     <a:prstGeom prst="rect">
                       <a:avLst/>
@@ -9106,7 +8843,7 @@
       <w:r>
         <w:drawing>
           <wp:inline>
-            <wp:extent cx="2933700" cy="2294355"/>
+            <wp:extent cx="2933700" cy="2604533"/>
             <wp:effectExtent b="0" l="0" r="0" t="0"/>
             <wp:docPr descr="FOLD_80_BASE_PENALTY: fold extra sequencing for 80% of targets to reach the mean (1.0 = perfectly uniform)." title="" id="50" name="Picture"/>
             <a:graphic>
@@ -9127,7 +8864,7 @@
                   <pic:spPr bwMode="auto">
                     <a:xfrm>
                       <a:off x="0" y="0"/>
-                      <a:ext cx="2933700" cy="2294355"/>
+                      <a:ext cx="2933700" cy="2604533"/>
                     </a:xfrm>
                     <a:prstGeom prst="rect">
                       <a:avLst/>
@@ -9161,7 +8898,7 @@
       <w:r>
         <w:drawing>
           <wp:inline>
-            <wp:extent cx="3200400" cy="2534677"/>
+            <wp:extent cx="3200400" cy="2859616"/>
             <wp:effectExtent b="0" l="0" r="0" t="0"/>
             <wp:docPr descr="Mean coverage depth per target gene per sample; spot under-covered genes (e.g. CR1/CFH)." title="" id="53" name="Picture"/>
             <a:graphic>
@@ -9182,7 +8919,7 @@
                   <pic:spPr bwMode="auto">
                     <a:xfrm>
                       <a:off x="0" y="0"/>
-                      <a:ext cx="3200400" cy="2534677"/>
+                      <a:ext cx="3200400" cy="2859616"/>
                     </a:xfrm>
                     <a:prstGeom prst="rect">
                       <a:avLst/>
@@ -9216,7 +8953,7 @@
       <w:r>
         <w:drawing>
           <wp:inline>
-            <wp:extent cx="2933700" cy="2074409"/>
+            <wp:extent cx="2933700" cy="2201172"/>
             <wp:effectExtent b="0" l="0" r="0" t="0"/>
             <wp:docPr descr="Fraction of target bases covered at &gt;= each depth, per sample (sensitivity for calling)." title="" id="56" name="Picture"/>
             <a:graphic>
@@ -9237,7 +8974,7 @@
                   <pic:spPr bwMode="auto">
                     <a:xfrm>
                       <a:off x="0" y="0"/>
-                      <a:ext cx="2933700" cy="2074409"/>
+                      <a:ext cx="2933700" cy="2201172"/>
                     </a:xfrm>
                     <a:prstGeom prst="rect">
                       <a:avLst/>
@@ -9348,7 +9085,7 @@
       <w:r>
         <w:drawing>
           <wp:inline>
-            <wp:extent cx="3733800" cy="2092491"/>
+            <wp:extent cx="3733800" cy="2391679"/>
             <wp:effectExtent b="0" l="0" r="0" t="0"/>
             <wp:docPr descr="Per-sample QC checks (green=pass, red=fail, grey=not assessed); sample label shows the gate decision. Quarantined samples are kept and reported, not dropped." title="" id="60" name="Picture"/>
             <a:graphic>
@@ -9369,7 +9106,7 @@
                   <pic:spPr bwMode="auto">
                     <a:xfrm>
                       <a:off x="0" y="0"/>
-                      <a:ext cx="3733800" cy="2092491"/>
+                      <a:ext cx="3733800" cy="2391679"/>
                     </a:xfrm>
                     <a:prstGeom prst="rect">
                       <a:avLst/>
@@ -9515,7 +9252,7 @@
       <w:r>
         <w:drawing>
           <wp:inline>
-            <wp:extent cx="2933700" cy="2098782"/>
+            <wp:extent cx="2933700" cy="2225690"/>
             <wp:effectExtent b="0" l="0" r="0" t="0"/>
             <wp:docPr descr="Distribution of per-sample mean target depth across the cohort vs the gate threshold." title="" id="63" name="Picture"/>
             <a:graphic>
@@ -9536,7 +9273,7 @@
                   <pic:spPr bwMode="auto">
                     <a:xfrm>
                       <a:off x="0" y="0"/>
-                      <a:ext cx="2933700" cy="2098782"/>
+                      <a:ext cx="2933700" cy="2225690"/>
                     </a:xfrm>
                     <a:prstGeom prst="rect">
                       <a:avLst/>
@@ -9570,7 +9307,7 @@
       <w:r>
         <w:drawing>
           <wp:inline>
-            <wp:extent cx="2933700" cy="2238122"/>
+            <wp:extent cx="2933700" cy="2522892"/>
             <wp:effectExtent b="0" l="0" r="0" t="0"/>
             <wp:docPr descr="VerifyBamID2 FREEMIX contamination estimate per sample vs threshold (grey note if no SVD panel available)." title="" id="66" name="Picture"/>
             <a:graphic>
@@ -9591,7 +9328,7 @@
                   <pic:spPr bwMode="auto">
                     <a:xfrm>
                       <a:off x="0" y="0"/>
-                      <a:ext cx="2933700" cy="2238122"/>
+                      <a:ext cx="2933700" cy="2522892"/>
                     </a:xfrm>
                     <a:prstGeom prst="rect">
                       <a:avLst/>
@@ -9625,7 +9362,7 @@
       <w:r>
         <w:drawing>
           <wp:inline>
-            <wp:extent cx="2933700" cy="2036826"/>
+            <wp:extent cx="2933700" cy="2281766"/>
             <wp:effectExtent b="0" l="0" r="0" t="0"/>
             <wp:docPr descr="Declared vs inferred sex per sample (grey note if the panel has no X/Y targets to infer from)." title="" id="69" name="Picture"/>
             <a:graphic>
@@ -9646,7 +9383,7 @@
                   <pic:spPr bwMode="auto">
                     <a:xfrm>
                       <a:off x="0" y="0"/>
-                      <a:ext cx="2933700" cy="2036826"/>
+                      <a:ext cx="2933700" cy="2281766"/>
                     </a:xfrm>
                     <a:prstGeom prst="rect">
                       <a:avLst/>
@@ -9779,7 +9516,7 @@
       <w:r>
         <w:drawing>
           <wp:inline>
-            <wp:extent cx="2933700" cy="2366718"/>
+            <wp:extent cx="2933700" cy="2596493"/>
             <wp:effectExtent b="0" l="0" r="0" t="0"/>
             <wp:docPr descr="Per-sample count of non-reference genotypes in the joint callset (calling yield)." title="" id="75" name="Picture"/>
             <a:graphic>
@@ -9800,7 +9537,7 @@
                   <pic:spPr bwMode="auto">
                     <a:xfrm>
                       <a:off x="0" y="0"/>
-                      <a:ext cx="2933700" cy="2366718"/>
+                      <a:ext cx="2933700" cy="2596493"/>
                     </a:xfrm>
                     <a:prstGeom prst="rect">
                       <a:avLst/>
@@ -9834,7 +9571,7 @@
       <w:r>
         <w:drawing>
           <wp:inline>
-            <wp:extent cx="2933700" cy="2190336"/>
+            <wp:extent cx="2933700" cy="2538144"/>
             <wp:effectExtent b="0" l="0" r="0" t="0"/>
             <wp:docPr descr="Transition/transversion ratio per sample; whole-exome ~3.0, smaller panels vary (calling quality)." title="" id="78" name="Picture"/>
             <a:graphic>
@@ -9855,7 +9592,7 @@
                   <pic:spPr bwMode="auto">
                     <a:xfrm>
                       <a:off x="0" y="0"/>
-                      <a:ext cx="2933700" cy="2190336"/>
+                      <a:ext cx="2933700" cy="2538144"/>
                     </a:xfrm>
                     <a:prstGeom prst="rect">
                       <a:avLst/>
@@ -9889,7 +9626,7 @@
       <w:r>
         <w:drawing>
           <wp:inline>
-            <wp:extent cx="2933700" cy="2214340"/>
+            <wp:extent cx="2933700" cy="2538144"/>
             <wp:effectExtent b="0" l="0" r="0" t="0"/>
             <wp:docPr descr="Heterozygous-to-homozygous-alt ratio per sample; extreme values flag sample-quality issues." title="" id="81" name="Picture"/>
             <a:graphic>
@@ -9910,7 +9647,7 @@
                   <pic:spPr bwMode="auto">
                     <a:xfrm>
                       <a:off x="0" y="0"/>
-                      <a:ext cx="2933700" cy="2214340"/>
+                      <a:ext cx="2933700" cy="2538144"/>
                     </a:xfrm>
                     <a:prstGeom prst="rect">
                       <a:avLst/>
@@ -9944,7 +9681,7 @@
       <w:r>
         <w:drawing>
           <wp:inline>
-            <wp:extent cx="2667000" cy="2174141"/>
+            <wp:extent cx="2667000" cy="2245491"/>
             <wp:effectExtent b="0" l="0" r="0" t="0"/>
             <wp:docPr descr="Variant counts before and after GATK hard-filtering, by type (sites retained)." title="" id="84" name="Picture"/>
             <a:graphic>
@@ -9965,7 +9702,7 @@
                   <pic:spPr bwMode="auto">
                     <a:xfrm>
                       <a:off x="0" y="0"/>
-                      <a:ext cx="2667000" cy="2174141"/>
+                      <a:ext cx="2667000" cy="2245491"/>
                     </a:xfrm>
                     <a:prstGeom prst="rect">
                       <a:avLst/>
@@ -9999,7 +9736,7 @@
       <w:r>
         <w:drawing>
           <wp:inline>
-            <wp:extent cx="2667000" cy="2183905"/>
+            <wp:extent cx="2667000" cy="2265017"/>
             <wp:effectExtent b="0" l="0" r="0" t="0"/>
             <wp:docPr descr="Fraction of called variants passing the GATK hard-filters, by type and overall." title="" id="87" name="Picture"/>
             <a:graphic>
@@ -10020,7 +9757,7 @@
                   <pic:spPr bwMode="auto">
                     <a:xfrm>
                       <a:off x="0" y="0"/>
-                      <a:ext cx="2667000" cy="2183905"/>
+                      <a:ext cx="2667000" cy="2265017"/>
                     </a:xfrm>
                     <a:prstGeom prst="rect">
                       <a:avLst/>
@@ -10054,7 +9791,7 @@
       <w:r>
         <w:drawing>
           <wp:inline>
-            <wp:extent cx="2933700" cy="2409510"/>
+            <wp:extent cx="2933700" cy="2522892"/>
             <wp:effectExtent b="0" l="0" r="0" t="0"/>
             <wp:docPr descr="Number of sites rejected by each hard-filter criterion (which filter removed what)." title="" id="90" name="Picture"/>
             <a:graphic>
@@ -10075,7 +9812,7 @@
                   <pic:spPr bwMode="auto">
                     <a:xfrm>
                       <a:off x="0" y="0"/>
-                      <a:ext cx="2933700" cy="2409510"/>
+                      <a:ext cx="2933700" cy="2522892"/>
                     </a:xfrm>
                     <a:prstGeom prst="rect">
                       <a:avLst/>
@@ -10119,7 +9856,7 @@
       <w:r>
         <w:drawing>
           <wp:inline>
-            <wp:extent cx="2933700" cy="2646825"/>
+            <wp:extent cx="2933700" cy="3060532"/>
             <wp:effectExtent b="0" l="0" r="0" t="0"/>
             <wp:docPr descr="CNV-target genes coloured by CaptureForge callability: green=depth-callable, red=breakpoint-blind (low-confidence, e.g. CR1/CFH)." title="" id="94" name="Picture"/>
             <a:graphic>
@@ -10140,7 +9877,7 @@
                   <pic:spPr bwMode="auto">
                     <a:xfrm>
                       <a:off x="0" y="0"/>
-                      <a:ext cx="2933700" cy="2646825"/>
+                      <a:ext cx="2933700" cy="3060532"/>
                     </a:xfrm>
                     <a:prstGeom prst="rect">
                       <a:avLst/>
@@ -10174,7 +9911,7 @@
       <w:r>
         <w:drawing>
           <wp:inline>
-            <wp:extent cx="3200400" cy="1961766"/>
+            <wp:extent cx="3200400" cy="2095988"/>
             <wp:effectExtent b="0" l="0" r="0" t="0"/>
             <wp:docPr descr="Per-target log2 copy ratio per sample; deviations from 0 indicate copy-number change." title="" id="97" name="Picture"/>
             <a:graphic>
@@ -10195,7 +9932,7 @@
                   <pic:spPr bwMode="auto">
                     <a:xfrm>
                       <a:off x="0" y="0"/>
-                      <a:ext cx="3200400" cy="1961766"/>
+                      <a:ext cx="3200400" cy="2095988"/>
                     </a:xfrm>
                     <a:prstGeom prst="rect">
                       <a:avLst/>
@@ -10294,7 +10031,7 @@
       <w:r>
         <w:drawing>
           <wp:inline>
-            <wp:extent cx="2933700" cy="2199271"/>
+            <wp:extent cx="2933700" cy="2326465"/>
             <wp:effectExtent b="0" l="0" r="0" t="0"/>
             <wp:docPr descr="Distribution of genotyped repeat-unit counts (allele sizes) per STR locus." title="" id="100" name="Picture"/>
             <a:graphic>
@@ -10315,7 +10052,7 @@
                   <pic:spPr bwMode="auto">
                     <a:xfrm>
                       <a:off x="0" y="0"/>
-                      <a:ext cx="2933700" cy="2199271"/>
+                      <a:ext cx="2933700" cy="2326465"/>
                     </a:xfrm>
                     <a:prstGeom prst="rect">
                       <a:avLst/>
@@ -10349,7 +10086,7 @@
       <w:r>
         <w:drawing>
           <wp:inline>
-            <wp:extent cx="2933700" cy="2315645"/>
+            <wp:extent cx="2933700" cy="2693162"/>
             <wp:effectExtent b="0" l="0" r="0" t="0"/>
             <wp:docPr descr="Variants in each paralog-ambiguous gene region, split into confident (uniquely callable, high MQ) vs flagged low-confidence (multimapping-ambiguous, low MQ)." title="" id="103" name="Picture"/>
             <a:graphic>
@@ -10370,7 +10107,7 @@
                   <pic:spPr bwMode="auto">
                     <a:xfrm>
                       <a:off x="0" y="0"/>
-                      <a:ext cx="2933700" cy="2315645"/>
+                      <a:ext cx="2933700" cy="2693162"/>
                     </a:xfrm>
                     <a:prstGeom prst="rect">
                       <a:avLst/>
@@ -10467,7 +10204,7 @@
       <w:r>
         <w:drawing>
           <wp:inline>
-            <wp:extent cx="2933700" cy="2250678"/>
+            <wp:extent cx="2933700" cy="2358227"/>
             <wp:effectExtent b="0" l="0" r="0" t="0"/>
             <wp:docPr descr="Fraction of callset variants that actually received each annotation (proof the annotation landed, not silently missed on a contig-name mismatch)." title="" id="107" name="Picture"/>
             <a:graphic>
@@ -10488,7 +10225,7 @@
                   <pic:spPr bwMode="auto">
                     <a:xfrm>
                       <a:off x="0" y="0"/>
-                      <a:ext cx="2933700" cy="2250678"/>
+                      <a:ext cx="2933700" cy="2358227"/>
                     </a:xfrm>
                     <a:prstGeom prst="rect">
                       <a:avLst/>
@@ -10522,7 +10259,7 @@
       <w:r>
         <w:drawing>
           <wp:inline>
-            <wp:extent cx="3200400" cy="1657674"/>
+            <wp:extent cx="3200400" cy="1783495"/>
             <wp:effectExtent b="0" l="0" r="0" t="0"/>
             <wp:docPr descr="Most-severe VEP consequence per variant across the callset." title="" id="110" name="Picture"/>
             <a:graphic>
@@ -10543,7 +10280,7 @@
                   <pic:spPr bwMode="auto">
                     <a:xfrm>
                       <a:off x="0" y="0"/>
-                      <a:ext cx="3200400" cy="1657674"/>
+                      <a:ext cx="3200400" cy="1783495"/>
                     </a:xfrm>
                     <a:prstGeom prst="rect">
                       <a:avLst/>
@@ -10577,7 +10314,7 @@
       <w:r>
         <w:drawing>
           <wp:inline>
-            <wp:extent cx="2400300" cy="2114273"/>
+            <wp:extent cx="2400300" cy="2190928"/>
             <wp:effectExtent b="0" l="0" r="0" t="0"/>
             <wp:docPr descr="Variants with a dbSNP rsID (known) vs without (novel) — novelty rate." title="" id="113" name="Picture"/>
             <a:graphic>
@@ -10598,7 +10335,7 @@
                   <pic:spPr bwMode="auto">
                     <a:xfrm>
                       <a:off x="0" y="0"/>
-                      <a:ext cx="2400300" cy="2114273"/>
+                      <a:ext cx="2400300" cy="2190928"/>
                     </a:xfrm>
                     <a:prstGeom prst="rect">
                       <a:avLst/>
@@ -10632,7 +10369,7 @@
       <w:r>
         <w:drawing>
           <wp:inline>
-            <wp:extent cx="2933700" cy="1895834"/>
+            <wp:extent cx="2933700" cy="2083844"/>
             <wp:effectExtent b="0" l="0" r="0" t="0"/>
             <wp:docPr descr="Distribution of gnomAD African-ancestry allele frequencies; title shows the % of variants carrying an AFR AF (key for rare-variant filtering / burden)." title="" id="116" name="Picture"/>
             <a:graphic>
@@ -10653,7 +10390,7 @@
                   <pic:spPr bwMode="auto">
                     <a:xfrm>
                       <a:off x="0" y="0"/>
-                      <a:ext cx="2933700" cy="1895834"/>
+                      <a:ext cx="2933700" cy="2083844"/>
                     </a:xfrm>
                     <a:prstGeom prst="rect">
                       <a:avLst/>
@@ -10687,7 +10424,7 @@
       <w:r>
         <w:drawing>
           <wp:inline>
-            <wp:extent cx="2933700" cy="2171493"/>
+            <wp:extent cx="2933700" cy="2201214"/>
             <wp:effectExtent b="0" l="0" r="0" t="0"/>
             <wp:docPr descr="PhyloP conservation-score distribution; positive = conserved (likely functional)." title="" id="119" name="Picture"/>
             <a:graphic>
@@ -10708,7 +10445,7 @@
                   <pic:spPr bwMode="auto">
                     <a:xfrm>
                       <a:off x="0" y="0"/>
-                      <a:ext cx="2933700" cy="2171493"/>
+                      <a:ext cx="2933700" cy="2201214"/>
                     </a:xfrm>
                     <a:prstGeom prst="rect">
                       <a:avLst/>
@@ -10752,7 +10489,7 @@
       <w:r>
         <w:drawing>
           <wp:inline>
-            <wp:extent cx="2667000" cy="2235854"/>
+            <wp:extent cx="2667000" cy="2392569"/>
             <wp:effectExtent b="0" l="0" r="0" t="0"/>
             <wp:docPr descr="Pairwise somalier relatedness; synthetic test samples are near-identical so values run high (machinery proven) — a real cohort shows true relatedness structure." title="" id="123" name="Picture"/>
             <a:graphic>
@@ -10773,7 +10510,7 @@
                   <pic:spPr bwMode="auto">
                     <a:xfrm>
                       <a:off x="0" y="0"/>
-                      <a:ext cx="2667000" cy="2235854"/>
+                      <a:ext cx="2667000" cy="2392569"/>
                     </a:xfrm>
                     <a:prstGeom prst="rect">
                       <a:avLst/>
@@ -10807,7 +10544,7 @@
       <w:r>
         <w:drawing>
           <wp:inline>
-            <wp:extent cx="2667000" cy="2170730"/>
+            <wp:extent cx="2667000" cy="2368693"/>
             <wp:effectExtent b="0" l="0" r="0" t="0"/>
             <wp:docPr descr="Genotype PCA of the cohort; on a tight panel few on-target sites give weak structure — real ancestry assignment uses somalier with the 1000G-labelled reference (off-target sites)." title="" id="126" name="Picture"/>
             <a:graphic>
@@ -10828,7 +10565,7 @@
                   <pic:spPr bwMode="auto">
                     <a:xfrm>
                       <a:off x="0" y="0"/>
-                      <a:ext cx="2667000" cy="2170730"/>
+                      <a:ext cx="2667000" cy="2368693"/>
                     </a:xfrm>
                     <a:prstGeom prst="rect">
                       <a:avLst/>
@@ -10862,7 +10599,7 @@
       <w:r>
         <w:drawing>
           <wp:inline>
-            <wp:extent cx="2933700" cy="2316309"/>
+            <wp:extent cx="2933700" cy="2714357"/>
             <wp:effectExtent b="0" l="0" r="0" t="0"/>
             <wp:docPr descr="Declared vs somalier-inferred sex per sample (somalier infers from X/Y signal incl. off-target reads — the backstop for an autosomal panel with no X/Y targets)." title="" id="129" name="Picture"/>
             <a:graphic>
@@ -10883,7 +10620,7 @@
                   <pic:spPr bwMode="auto">
                     <a:xfrm>
                       <a:off x="0" y="0"/>
-                      <a:ext cx="2933700" cy="2316309"/>
+                      <a:ext cx="2933700" cy="2714357"/>
                     </a:xfrm>
                     <a:prstGeom prst="rect">
                       <a:avLst/>
@@ -10917,7 +10654,7 @@
       <w:r>
         <w:drawing>
           <wp:inline>
-            <wp:extent cx="2933700" cy="2346108"/>
+            <wp:extent cx="2933700" cy="2538144"/>
             <wp:effectExtent b="0" l="0" r="0" t="0"/>
             <wp:docPr descr="Per-sample fraction of no-call genotypes in the joint callset (sample quality)." title="" id="132" name="Picture"/>
             <a:graphic>
@@ -10938,7 +10675,7 @@
                   <pic:spPr bwMode="auto">
                     <a:xfrm>
                       <a:off x="0" y="0"/>
-                      <a:ext cx="2933700" cy="2346108"/>
+                      <a:ext cx="2933700" cy="2538144"/>
                     </a:xfrm>
                     <a:prstGeom prst="rect">
                       <a:avLst/>
@@ -10982,7 +10719,7 @@
       <w:r>
         <w:drawing>
           <wp:inline>
-            <wp:extent cx="2667000" cy="1958186"/>
+            <wp:extent cx="2667000" cy="2198118"/>
             <wp:effectExtent b="0" l="0" r="0" t="0"/>
             <wp:docPr descr="hap.py precision &amp; recall vs GIAB truth, restricted to the panel BED (on-target). Synthetic test only proves the machinery; real numbers need a GIAB control + truth v4.2.1." title="" id="136" name="Picture"/>
             <a:graphic>
@@ -11003,7 +10740,7 @@
                   <pic:spPr bwMode="auto">
                     <a:xfrm>
                       <a:off x="0" y="0"/>
-                      <a:ext cx="2667000" cy="1958186"/>
+                      <a:ext cx="2667000" cy="2198118"/>
                     </a:xfrm>
                     <a:prstGeom prst="rect">
                       <a:avLst/>
@@ -11037,7 +10774,7 @@
       <w:r>
         <w:drawing>
           <wp:inline>
-            <wp:extent cx="2400300" cy="1936525"/>
+            <wp:extent cx="2400300" cy="2059408"/>
             <wp:effectExtent b="0" l="0" r="0" t="0"/>
             <wp:docPr descr="hap.py F1 per variant type vs GIAB truth, restricted to the panel BED (on-target)." title="" id="139" name="Picture"/>
             <a:graphic>
@@ -11058,7 +10795,7 @@
                   <pic:spPr bwMode="auto">
                     <a:xfrm>
                       <a:off x="0" y="0"/>
-                      <a:ext cx="2400300" cy="1936525"/>
+                      <a:ext cx="2400300" cy="2059408"/>
                     </a:xfrm>
                     <a:prstGeom prst="rect">
                       <a:avLst/>
@@ -11102,7 +10839,7 @@
       <w:r>
         <w:drawing>
           <wp:inline>
-            <wp:extent cx="2667000" cy="2549058"/>
+            <wp:extent cx="2667000" cy="2815383"/>
             <wp:effectExtent b="0" l="0" r="0" t="0"/>
             <wp:docPr descr="QQ plot of gene-burden p-values vs uniform expectation; lambda = genomic inflation. Small-N synthetic results prove the machinery only — not valid association." title="" id="143" name="Picture"/>
             <a:graphic>
@@ -11123,7 +10860,7 @@
                   <pic:spPr bwMode="auto">
                     <a:xfrm>
                       <a:off x="0" y="0"/>
-                      <a:ext cx="2667000" cy="2549058"/>
+                      <a:ext cx="2667000" cy="2815383"/>
                     </a:xfrm>
                     <a:prstGeom prst="rect">
                       <a:avLst/>
@@ -11157,7 +10894,7 @@
       <w:r>
         <w:drawing>
           <wp:inline>
-            <wp:extent cx="2933700" cy="2296294"/>
+            <wp:extent cx="2933700" cy="2693162"/>
             <wp:effectExtent b="0" l="0" r="0" t="0"/>
             <wp:docPr descr="Per-gene burden significance (-log10 p) with a Bonferroni line; collapses rare+functional variants per gene. Validity depends on N, phenotype definition, ancestry matching." title="" id="146" name="Picture"/>
             <a:graphic>
@@ -11178,7 +10915,7 @@
                   <pic:spPr bwMode="auto">
                     <a:xfrm>
                       <a:off x="0" y="0"/>
-                      <a:ext cx="2933700" cy="2296294"/>
+                      <a:ext cx="2933700" cy="2693162"/>
                     </a:xfrm>
                     <a:prstGeom prst="rect">
                       <a:avLst/>
@@ -11224,9 +10961,9 @@
         <w:tblLook w:firstRow="1" w:lastRow="0" w:firstColumn="0" w:lastColumn="0" w:noHBand="0" w:noVBand="0" w:val="0020"/>
       </w:tblPr>
       <w:tblGrid>
-        <w:gridCol w:w="2640"/>
-        <w:gridCol w:w="2640"/>
-        <w:gridCol w:w="2640"/>
+        <w:gridCol w:w="1410"/>
+        <w:gridCol w:w="1627"/>
+        <w:gridCol w:w="4882"/>
       </w:tblGrid>
       <w:tr>
         <w:trPr>
@@ -11237,6 +10974,7 @@
           <w:p>
             <w:pPr>
               <w:pStyle w:val="Compact"/>
+              <w:jc w:val="left"/>
             </w:pPr>
             <w:r>
               <w:t xml:space="preserve">Output</w:t>
@@ -11248,20 +10986,22 @@
           <w:p>
             <w:pPr>
               <w:pStyle w:val="Compact"/>
-            </w:pPr>
-            <w:r>
-              <w:t xml:space="preserve">Path</w:t>
-            </w:r>
-          </w:p>
-        </w:tc>
-        <w:tc>
-          <w:tcPr/>
-          <w:p>
-            <w:pPr>
-              <w:pStyle w:val="Compact"/>
-            </w:pPr>
-            <w:r>
-              <w:t xml:space="preserve">Notes</w:t>
+              <w:jc w:val="left"/>
+            </w:pPr>
+            <w:r>
+              <w:t xml:space="preserve">Location</w:t>
+            </w:r>
+          </w:p>
+        </w:tc>
+        <w:tc>
+          <w:tcPr/>
+          <w:p>
+            <w:pPr>
+              <w:pStyle w:val="Compact"/>
+              <w:jc w:val="left"/>
+            </w:pPr>
+            <w:r>
+              <w:t xml:space="preserve">File + notes</w:t>
             </w:r>
           </w:p>
         </w:tc>
@@ -11272,6 +11012,7 @@
           <w:p>
             <w:pPr>
               <w:pStyle w:val="Compact"/>
+              <w:jc w:val="left"/>
             </w:pPr>
             <w:r>
               <w:t xml:space="preserve">Annotated joint VCF</w:t>
@@ -11283,68 +11024,22 @@
           <w:p>
             <w:pPr>
               <w:pStyle w:val="Compact"/>
-            </w:pPr>
-            <w:r>
-              <w:rPr>
-                <w:rStyle w:val="VerbatimChar"/>
-              </w:rPr>
-              <w:t xml:space="preserve">stage11_annotation/annotated.vcf.gz</w:t>
-            </w:r>
-          </w:p>
-        </w:tc>
-        <w:tc>
-          <w:tcPr/>
-          <w:p>
-            <w:pPr>
-              <w:pStyle w:val="Compact"/>
-            </w:pPr>
-            <w:r>
-              <w:t xml:space="preserve">VEP CSQ +</w:t>
-            </w:r>
-            <w:r>
-              <w:t xml:space="preserve"> </w:t>
-            </w:r>
-            <w:r>
-              <w:rPr>
-                <w:rStyle w:val="VerbatimChar"/>
-              </w:rPr>
-              <w:t xml:space="preserve">gnomAD_*</w:t>
-            </w:r>
-            <w:r>
-              <w:t xml:space="preserve"> </w:t>
-            </w:r>
-            <w:r>
-              <w:t xml:space="preserve">+</w:t>
-            </w:r>
-            <w:r>
-              <w:t xml:space="preserve"> </w:t>
-            </w:r>
-            <w:r>
-              <w:rPr>
-                <w:rStyle w:val="VerbatimChar"/>
-              </w:rPr>
-              <w:t xml:space="preserve">ClinVar_*</w:t>
-            </w:r>
-            <w:r>
-              <w:t xml:space="preserve"> </w:t>
-            </w:r>
-            <w:r>
-              <w:t xml:space="preserve">+</w:t>
-            </w:r>
-            <w:r>
-              <w:t xml:space="preserve"> </w:t>
-            </w:r>
-            <w:r>
-              <w:rPr>
-                <w:rStyle w:val="VerbatimChar"/>
-              </w:rPr>
-              <w:t xml:space="preserve">PhyloP</w:t>
-            </w:r>
-            <w:r>
-              <w:t xml:space="preserve"> </w:t>
-            </w:r>
-            <w:r>
-              <w:t xml:space="preserve">+ paralog flags</w:t>
+              <w:jc w:val="left"/>
+            </w:pPr>
+            <w:r>
+              <w:t xml:space="preserve">stage11_annotation/</w:t>
+            </w:r>
+          </w:p>
+        </w:tc>
+        <w:tc>
+          <w:tcPr/>
+          <w:p>
+            <w:pPr>
+              <w:pStyle w:val="Compact"/>
+              <w:jc w:val="left"/>
+            </w:pPr>
+            <w:r>
+              <w:t xml:space="preserve">annotated.vcf.gz — VEP CSQ + gnomAD_* + ClinVar_* + PhyloP + paralog flags</w:t>
             </w:r>
           </w:p>
         </w:tc>
@@ -11355,6 +11050,7 @@
           <w:p>
             <w:pPr>
               <w:pStyle w:val="Compact"/>
+              <w:jc w:val="left"/>
             </w:pPr>
             <w:r>
               <w:t xml:space="preserve">Per-variant TSV</w:t>
@@ -11366,23 +11062,22 @@
           <w:p>
             <w:pPr>
               <w:pStyle w:val="Compact"/>
-            </w:pPr>
-            <w:r>
-              <w:rPr>
-                <w:rStyle w:val="VerbatimChar"/>
-              </w:rPr>
-              <w:t xml:space="preserve">stage11_annotation/variants.flat.tsv</w:t>
-            </w:r>
-          </w:p>
-        </w:tc>
-        <w:tc>
-          <w:tcPr/>
-          <w:p>
-            <w:pPr>
-              <w:pStyle w:val="Compact"/>
-            </w:pPr>
-            <w:r>
-              <w:t xml:space="preserve">flattened; columns below</w:t>
+              <w:jc w:val="left"/>
+            </w:pPr>
+            <w:r>
+              <w:t xml:space="preserve">stage11_annotation/</w:t>
+            </w:r>
+          </w:p>
+        </w:tc>
+        <w:tc>
+          <w:tcPr/>
+          <w:p>
+            <w:pPr>
+              <w:pStyle w:val="Compact"/>
+              <w:jc w:val="left"/>
+            </w:pPr>
+            <w:r>
+              <w:t xml:space="preserve">variants.flat.tsv — flattened (columns below)</w:t>
             </w:r>
           </w:p>
         </w:tc>
@@ -11393,6 +11088,7 @@
           <w:p>
             <w:pPr>
               <w:pStyle w:val="Compact"/>
+              <w:jc w:val="left"/>
             </w:pPr>
             <w:r>
               <w:t xml:space="preserve">Filtered joint VCF</w:t>
@@ -11404,23 +11100,22 @@
           <w:p>
             <w:pPr>
               <w:pStyle w:val="Compact"/>
-            </w:pPr>
-            <w:r>
-              <w:rPr>
-                <w:rStyle w:val="VerbatimChar"/>
-              </w:rPr>
-              <w:t xml:space="preserve">stage7_filter/joint.filtered.vcf.gz</w:t>
-            </w:r>
-          </w:p>
-        </w:tc>
-        <w:tc>
-          <w:tcPr/>
-          <w:p>
-            <w:pPr>
-              <w:pStyle w:val="Compact"/>
-            </w:pPr>
-            <w:r>
-              <w:t xml:space="preserve">FILTER = PASS / hard-filter name</w:t>
+              <w:jc w:val="left"/>
+            </w:pPr>
+            <w:r>
+              <w:t xml:space="preserve">stage7_filter/</w:t>
+            </w:r>
+          </w:p>
+        </w:tc>
+        <w:tc>
+          <w:tcPr/>
+          <w:p>
+            <w:pPr>
+              <w:pStyle w:val="Compact"/>
+              <w:jc w:val="left"/>
+            </w:pPr>
+            <w:r>
+              <w:t xml:space="preserve">joint.filtered.vcf.gz — FILTER = PASS or hard-filter name</w:t>
             </w:r>
           </w:p>
         </w:tc>
@@ -11431,6 +11126,7 @@
           <w:p>
             <w:pPr>
               <w:pStyle w:val="Compact"/>
+              <w:jc w:val="left"/>
             </w:pPr>
             <w:r>
               <w:t xml:space="preserve">CNV calls</w:t>
@@ -11442,47 +11138,22 @@
           <w:p>
             <w:pPr>
               <w:pStyle w:val="Compact"/>
-            </w:pPr>
-            <w:r>
-              <w:rPr>
-                <w:rStyle w:val="VerbatimChar"/>
-              </w:rPr>
-              <w:t xml:space="preserve">stage8_cnv/cnv_calls.tsv</w:t>
-            </w:r>
-          </w:p>
-        </w:tc>
-        <w:tc>
-          <w:tcPr/>
-          <w:p>
-            <w:pPr>
-              <w:pStyle w:val="Compact"/>
-            </w:pPr>
-            <w:r>
-              <w:t xml:space="preserve">with</w:t>
-            </w:r>
-            <w:r>
-              <w:t xml:space="preserve"> </w:t>
-            </w:r>
-            <w:r>
-              <w:rPr>
-                <w:rStyle w:val="VerbatimChar"/>
-              </w:rPr>
-              <w:t xml:space="preserve">cnv_callable</w:t>
-            </w:r>
-            <w:r>
-              <w:t xml:space="preserve"> </w:t>
-            </w:r>
-            <w:r>
-              <w:t xml:space="preserve">+</w:t>
-            </w:r>
-            <w:r>
-              <w:t xml:space="preserve"> </w:t>
-            </w:r>
-            <w:r>
-              <w:rPr>
-                <w:rStyle w:val="VerbatimChar"/>
-              </w:rPr>
-              <w:t xml:space="preserve">confidence</w:t>
+              <w:jc w:val="left"/>
+            </w:pPr>
+            <w:r>
+              <w:t xml:space="preserve">stage8_cnv/</w:t>
+            </w:r>
+          </w:p>
+        </w:tc>
+        <w:tc>
+          <w:tcPr/>
+          <w:p>
+            <w:pPr>
+              <w:pStyle w:val="Compact"/>
+              <w:jc w:val="left"/>
+            </w:pPr>
+            <w:r>
+              <w:t xml:space="preserve">cnv_calls.tsv — with cnv_callable + confidence columns</w:t>
             </w:r>
           </w:p>
         </w:tc>
@@ -11493,6 +11164,7 @@
           <w:p>
             <w:pPr>
               <w:pStyle w:val="Compact"/>
+              <w:jc w:val="left"/>
             </w:pPr>
             <w:r>
               <w:t xml:space="preserve">STR genotypes</w:t>
@@ -11504,23 +11176,22 @@
           <w:p>
             <w:pPr>
               <w:pStyle w:val="Compact"/>
-            </w:pPr>
-            <w:r>
-              <w:rPr>
-                <w:rStyle w:val="VerbatimChar"/>
-              </w:rPr>
-              <w:t xml:space="preserve">stage9_str/str_calls.tsv</w:t>
-            </w:r>
-          </w:p>
-        </w:tc>
-        <w:tc>
-          <w:tcPr/>
-          <w:p>
-            <w:pPr>
-              <w:pStyle w:val="Compact"/>
-            </w:pPr>
-            <w:r>
-              <w:t xml:space="preserve">repeat units, read support, call rate</w:t>
+              <w:jc w:val="left"/>
+            </w:pPr>
+            <w:r>
+              <w:t xml:space="preserve">stage9_str/</w:t>
+            </w:r>
+          </w:p>
+        </w:tc>
+        <w:tc>
+          <w:tcPr/>
+          <w:p>
+            <w:pPr>
+              <w:pStyle w:val="Compact"/>
+              <w:jc w:val="left"/>
+            </w:pPr>
+            <w:r>
+              <w:t xml:space="preserve">str_calls.tsv — repeat units, read support, call rate</w:t>
             </w:r>
           </w:p>
         </w:tc>
@@ -11531,6 +11202,7 @@
           <w:p>
             <w:pPr>
               <w:pStyle w:val="Compact"/>
+              <w:jc w:val="left"/>
             </w:pPr>
             <w:r>
               <w:t xml:space="preserve">Paralog VCF</w:t>
@@ -11542,38 +11214,22 @@
           <w:p>
             <w:pPr>
               <w:pStyle w:val="Compact"/>
-            </w:pPr>
-            <w:r>
-              <w:rPr>
-                <w:rStyle w:val="VerbatimChar"/>
-              </w:rPr>
-              <w:t xml:space="preserve">stage10_paralog/paralog.annotated.vcf.gz</w:t>
-            </w:r>
-          </w:p>
-        </w:tc>
-        <w:tc>
-          <w:tcPr/>
-          <w:p>
-            <w:pPr>
-              <w:pStyle w:val="Compact"/>
-            </w:pPr>
-            <w:r>
-              <w:rPr>
-                <w:rStyle w:val="VerbatimChar"/>
-              </w:rPr>
-              <w:t xml:space="preserve">INFO/PARALOG_GENE</w:t>
-            </w:r>
-            <w:r>
-              <w:t xml:space="preserve">,</w:t>
-            </w:r>
-            <w:r>
-              <w:t xml:space="preserve"> </w:t>
-            </w:r>
-            <w:r>
-              <w:rPr>
-                <w:rStyle w:val="VerbatimChar"/>
-              </w:rPr>
-              <w:t xml:space="preserve">PARALOG_CONF</w:t>
+              <w:jc w:val="left"/>
+            </w:pPr>
+            <w:r>
+              <w:t xml:space="preserve">stage10_paralog/</w:t>
+            </w:r>
+          </w:p>
+        </w:tc>
+        <w:tc>
+          <w:tcPr/>
+          <w:p>
+            <w:pPr>
+              <w:pStyle w:val="Compact"/>
+              <w:jc w:val="left"/>
+            </w:pPr>
+            <w:r>
+              <w:t xml:space="preserve">paralog.annotated.vcf.gz — INFO/PARALOG_GENE, PARALOG_CONF</w:t>
             </w:r>
           </w:p>
         </w:tc>
@@ -11584,6 +11240,7 @@
           <w:p>
             <w:pPr>
               <w:pStyle w:val="Compact"/>
+              <w:jc w:val="left"/>
             </w:pPr>
             <w:r>
               <w:t xml:space="preserve">Burden results</w:t>
@@ -11595,32 +11252,22 @@
           <w:p>
             <w:pPr>
               <w:pStyle w:val="Compact"/>
-            </w:pPr>
-            <w:r>
-              <w:rPr>
-                <w:rStyle w:val="VerbatimChar"/>
-              </w:rPr>
-              <w:t xml:space="preserve">stage14_burden/burden_results.tsv</w:t>
-            </w:r>
-          </w:p>
-        </w:tc>
-        <w:tc>
-          <w:tcPr/>
-          <w:p>
-            <w:pPr>
-              <w:pStyle w:val="Compact"/>
-            </w:pPr>
-            <w:r>
-              <w:rPr>
-                <w:rStyle w:val="VerbatimChar"/>
-              </w:rPr>
-              <w:t xml:space="preserve">engine</w:t>
-            </w:r>
-            <w:r>
-              <w:t xml:space="preserve"> </w:t>
-            </w:r>
-            <w:r>
-              <w:t xml:space="preserve">column stamps the method</w:t>
+              <w:jc w:val="left"/>
+            </w:pPr>
+            <w:r>
+              <w:t xml:space="preserve">stage14_burden/</w:t>
+            </w:r>
+          </w:p>
+        </w:tc>
+        <w:tc>
+          <w:tcPr/>
+          <w:p>
+            <w:pPr>
+              <w:pStyle w:val="Compact"/>
+              <w:jc w:val="left"/>
+            </w:pPr>
+            <w:r>
+              <w:t xml:space="preserve">burden_results.tsv — engine column stamps the method</w:t>
             </w:r>
           </w:p>
         </w:tc>
@@ -11631,6 +11278,7 @@
           <w:p>
             <w:pPr>
               <w:pStyle w:val="Compact"/>
+              <w:jc w:val="left"/>
             </w:pPr>
             <w:r>
               <w:t xml:space="preserve">Cohort QC</w:t>
@@ -11642,23 +11290,22 @@
           <w:p>
             <w:pPr>
               <w:pStyle w:val="Compact"/>
-            </w:pPr>
-            <w:r>
-              <w:rPr>
-                <w:rStyle w:val="VerbatimChar"/>
-              </w:rPr>
-              <w:t xml:space="preserve">stage12_cohortqc/cohort_qc.json</w:t>
-            </w:r>
-          </w:p>
-        </w:tc>
-        <w:tc>
-          <w:tcPr/>
-          <w:p>
-            <w:pPr>
-              <w:pStyle w:val="Compact"/>
-            </w:pPr>
-            <w:r>
-              <w:t xml:space="preserve">relatedness, sex, missingness, PCA</w:t>
+              <w:jc w:val="left"/>
+            </w:pPr>
+            <w:r>
+              <w:t xml:space="preserve">stage12_cohortqc/</w:t>
+            </w:r>
+          </w:p>
+        </w:tc>
+        <w:tc>
+          <w:tcPr/>
+          <w:p>
+            <w:pPr>
+              <w:pStyle w:val="Compact"/>
+              <w:jc w:val="left"/>
+            </w:pPr>
+            <w:r>
+              <w:t xml:space="preserve">cohort_qc.json — relatedness, sex, missingness, PCA</w:t>
             </w:r>
           </w:p>
         </w:tc>
@@ -11669,6 +11316,7 @@
           <w:p>
             <w:pPr>
               <w:pStyle w:val="Compact"/>
+              <w:jc w:val="left"/>
             </w:pPr>
             <w:r>
               <w:t xml:space="preserve">GIAB metrics</w:t>
@@ -11680,23 +11328,22 @@
           <w:p>
             <w:pPr>
               <w:pStyle w:val="Compact"/>
-            </w:pPr>
-            <w:r>
-              <w:rPr>
-                <w:rStyle w:val="VerbatimChar"/>
-              </w:rPr>
-              <w:t xml:space="preserve">stage13_giab/plots/giab_metrics.json</w:t>
-            </w:r>
-          </w:p>
-        </w:tc>
-        <w:tc>
-          <w:tcPr/>
-          <w:p>
-            <w:pPr>
-              <w:pStyle w:val="Compact"/>
-            </w:pPr>
-            <w:r>
-              <w:t xml:space="preserve">precision/recall/F1, on-target</w:t>
+              <w:jc w:val="left"/>
+            </w:pPr>
+            <w:r>
+              <w:t xml:space="preserve">stage13_giab/</w:t>
+            </w:r>
+          </w:p>
+        </w:tc>
+        <w:tc>
+          <w:tcPr/>
+          <w:p>
+            <w:pPr>
+              <w:pStyle w:val="Compact"/>
+              <w:jc w:val="left"/>
+            </w:pPr>
+            <w:r>
+              <w:t xml:space="preserve">giab_metrics.json — precision/recall/F1, on-target</w:t>
             </w:r>
           </w:p>
         </w:tc>
@@ -11707,6 +11354,7 @@
           <w:p>
             <w:pPr>
               <w:pStyle w:val="Compact"/>
+              <w:jc w:val="left"/>
             </w:pPr>
             <w:r>
               <w:t xml:space="preserve">Provenance</w:t>
@@ -11718,23 +11366,22 @@
           <w:p>
             <w:pPr>
               <w:pStyle w:val="Compact"/>
-            </w:pPr>
-            <w:r>
-              <w:rPr>
-                <w:rStyle w:val="VerbatimChar"/>
-              </w:rPr>
-              <w:t xml:space="preserve">stage15_report/provenance.json</w:t>
-            </w:r>
-          </w:p>
-        </w:tc>
-        <w:tc>
-          <w:tcPr/>
-          <w:p>
-            <w:pPr>
-              <w:pStyle w:val="Compact"/>
-            </w:pPr>
-            <w:r>
-              <w:t xml:space="preserve">versions, resources, quarantine, PC gate</w:t>
+              <w:jc w:val="left"/>
+            </w:pPr>
+            <w:r>
+              <w:t xml:space="preserve">stage15_report/</w:t>
+            </w:r>
+          </w:p>
+        </w:tc>
+        <w:tc>
+          <w:tcPr/>
+          <w:p>
+            <w:pPr>
+              <w:pStyle w:val="Compact"/>
+              <w:jc w:val="left"/>
+            </w:pPr>
+            <w:r>
+              <w:t xml:space="preserve">provenance.json — versions, resources, quarantine, PC gate</w:t>
             </w:r>
           </w:p>
         </w:tc>
@@ -11745,6 +11392,7 @@
           <w:p>
             <w:pPr>
               <w:pStyle w:val="Compact"/>
+              <w:jc w:val="left"/>
             </w:pPr>
             <w:r>
               <w:t xml:space="preserve">Dashboard</w:t>
@@ -11756,23 +11404,22 @@
           <w:p>
             <w:pPr>
               <w:pStyle w:val="Compact"/>
-            </w:pPr>
-            <w:r>
-              <w:rPr>
-                <w:rStyle w:val="VerbatimChar"/>
-              </w:rPr>
-              <w:t xml:space="preserve">stage15_report/cohort_qc_dashboard.html</w:t>
-            </w:r>
-          </w:p>
-        </w:tc>
-        <w:tc>
-          <w:tcPr/>
-          <w:p>
-            <w:pPr>
-              <w:pStyle w:val="Compact"/>
-            </w:pPr>
-            <w:r>
-              <w:t xml:space="preserve">all figures + tables</w:t>
+              <w:jc w:val="left"/>
+            </w:pPr>
+            <w:r>
+              <w:t xml:space="preserve">stage15_report/</w:t>
+            </w:r>
+          </w:p>
+        </w:tc>
+        <w:tc>
+          <w:tcPr/>
+          <w:p>
+            <w:pPr>
+              <w:pStyle w:val="Compact"/>
+              <w:jc w:val="left"/>
+            </w:pPr>
+            <w:r>
+              <w:t xml:space="preserve">cohort_qc_dashboard.html — all figures + tables</w:t>
             </w:r>
           </w:p>
         </w:tc>

</xml_diff>